<commit_message>
Renumber sections and steps to start at 1 (remove zero-based numbering)
</commit_message>
<xml_diff>
--- a/workshop instruction/WS1 - Simulink IoT with ThingSpeak and ESP32_en.docx
+++ b/workshop instruction/WS1 - Simulink IoT with ThingSpeak and ESP32_en.docx
@@ -287,7 +287,7 @@
         <w:pStyle w:val="Heading1"/>
       </w:pPr>
       <w:r>
-        <w:t>0. Workshop Overview</w:t>
+        <w:t>1. Workshop Overview</w:t>
       </w:r>
     </w:p>
     <w:p>
@@ -575,7 +575,7 @@
         <w:pStyle w:val="Heading1"/>
       </w:pPr>
       <w:r>
-        <w:t>1. Learning Objectives</w:t>
+        <w:t>2. Learning Objectives</w:t>
       </w:r>
     </w:p>
     <w:p>
@@ -623,7 +623,7 @@
         <w:pStyle w:val="Heading1"/>
       </w:pPr>
       <w:r>
-        <w:t>2. Step 0 — Verify Toolboxes &amp; Connect the ESP32 (~10 min)</w:t>
+        <w:t>3. Step 1 — Verify Toolboxes &amp; Connect the ESP32 (~10 min)</w:t>
       </w:r>
     </w:p>
     <w:p>
@@ -742,7 +742,7 @@
         <w:pStyle w:val="Heading1"/>
       </w:pPr>
       <w:r>
-        <w:t>3. Step 1 — Create a ThingSpeak Account &amp; Channel (~10 min)</w:t>
+        <w:t>4. Step 2 — Create a ThingSpeak Account &amp; Channel (~10 min)</w:t>
       </w:r>
     </w:p>
     <w:p>
@@ -755,7 +755,7 @@
         <w:pStyle w:val="Heading2"/>
       </w:pPr>
       <w:r>
-        <w:t>3a. Create the account</w:t>
+        <w:t>4a. Create the account</w:t>
       </w:r>
     </w:p>
     <w:p>
@@ -831,7 +831,7 @@
         <w:pStyle w:val="Heading2"/>
       </w:pPr>
       <w:r>
-        <w:t>3b. Create a private channel</w:t>
+        <w:t>4b. Create a private channel</w:t>
       </w:r>
     </w:p>
     <w:p>
@@ -1165,7 +1165,7 @@
         <w:pStyle w:val="Heading2"/>
       </w:pPr>
       <w:r>
-        <w:t>3c. Collect the four credentials</w:t>
+        <w:t>4c. Collect the four credentials</w:t>
       </w:r>
     </w:p>
     <w:p>
@@ -1228,7 +1228,7 @@
     </w:p>
     <w:p>
       <w:r>
-        <w:t>Record these for Step 3/4 — you will enter them into the Simulink model:</w:t>
+        <w:t>Record these for Step 4/5 — you will enter them into the Simulink model:</w:t>
       </w:r>
     </w:p>
     <w:tbl>
@@ -1393,7 +1393,7 @@
         <w:pStyle w:val="Heading1"/>
       </w:pPr>
       <w:r>
-        <w:t>4. Step 2 — Explore the Starter Model (~5 min)</w:t>
+        <w:t>5. Step 3 — Explore the Starter Model (~5 min)</w:t>
       </w:r>
     </w:p>
     <w:p>
@@ -1480,7 +1480,7 @@
     </w:p>
     <w:p>
       <w:r>
-        <w:t>- **Switch / Switch2** — select the **Simulated** input (from the knobs) or the **Hardware** input (from the ESP32 ADC, added in Step 4).</w:t>
+        <w:t>- **Switch / Switch2** — select the **Simulated** input (from the knobs) or the **Hardware** input (from the ESP32 ADC, added in Step 5).</w:t>
       </w:r>
     </w:p>
     <w:p>
@@ -1503,7 +1503,7 @@
         <w:pStyle w:val="Heading1"/>
       </w:pPr>
       <w:r>
-        <w:t>5. Step 3 — Configure the ESP32 Target (~5 min)</w:t>
+        <w:t>6. Step 4 — Configure the ESP32 Target (~5 min)</w:t>
       </w:r>
     </w:p>
     <w:p>
@@ -2175,7 +2175,7 @@
         <w:pStyle w:val="Heading1"/>
       </w:pPr>
       <w:r>
-        <w:t>6. Steps 4–7 — Build the IoT &amp; Hardware Blocks (~40 min)</w:t>
+        <w:t>7. Steps 5–8 — Build the IoT &amp; Hardware Blocks (~40 min)</w:t>
       </w:r>
     </w:p>
     <w:p>
@@ -2188,7 +2188,7 @@
         <w:pStyle w:val="Heading2"/>
       </w:pPr>
       <w:r>
-        <w:t>Step 4: Analog inputs + DAC loop-back</w:t>
+        <w:t>Step 5: Analog inputs + DAC loop-back</w:t>
       </w:r>
     </w:p>
     <w:p>
@@ -2279,7 +2279,7 @@
         <w:pStyle w:val="Heading2"/>
       </w:pPr>
       <w:r>
-        <w:t>Step 5: Publish to ThingSpeak over MQTT</w:t>
+        <w:t>Step 6: Publish to ThingSpeak over MQTT</w:t>
       </w:r>
     </w:p>
     <w:p>
@@ -2493,7 +2493,7 @@
     </w:p>
     <w:p>
       <w:r>
-        <w:t>📡 The block uses the **Wi-Fi** and **ThingSpeak MQTT credentials** you set in **Step 3** (Model Settings → Target hardware resources). ThingSpeak's MQTT broker is `mqtt3.thingspeak.com`, port `1883`; the block keeps a persistent connection and publishes on the interval.</w:t>
+        <w:t>📡 The block uses the **Wi-Fi** and **ThingSpeak MQTT credentials** you set in **Step 4** (Model Settings → Target hardware resources). ThingSpeak's MQTT broker is `mqtt3.thingspeak.com`, port `1883`; the block keeps a persistent connection and publishes on the interval.</w:t>
       </w:r>
     </w:p>
     <w:p>
@@ -2501,7 +2501,7 @@
         <w:pStyle w:val="Heading2"/>
       </w:pPr>
       <w:r>
-        <w:t>Step 6: Fan / activity logic (threshold)</w:t>
+        <w:t>Step 7: Fan / activity logic (threshold)</w:t>
       </w:r>
     </w:p>
     <w:p>
@@ -2645,7 +2645,7 @@
         <w:pStyle w:val="Heading2"/>
       </w:pPr>
       <w:r>
-        <w:t>Step 7: Read your own channel back (closed loop)</w:t>
+        <w:t>Step 8: Read your own channel back (closed loop)</w:t>
       </w:r>
     </w:p>
     <w:p>
@@ -2824,7 +2824,7 @@
         <w:pStyle w:val="Heading1"/>
       </w:pPr>
       <w:r>
-        <w:t>7. Step 8 — Deploy &amp; Stream Live Data (~15 min)</w:t>
+        <w:t>8. Step 9 — Deploy &amp; Stream Live Data (~15 min)</w:t>
       </w:r>
     </w:p>
     <w:p>
@@ -2837,7 +2837,7 @@
         <w:pStyle w:val="Heading2"/>
       </w:pPr>
       <w:r>
-        <w:t>Step 8a — Run with Monitor &amp; Tune (Hardware tab)</w:t>
+        <w:t>Step 9a — Run with Monitor &amp; Tune (Hardware tab)</w:t>
       </w:r>
     </w:p>
     <w:p>
@@ -2905,7 +2905,7 @@
     </w:p>
     <w:p>
       <w:r>
-        <w:t>⚠️ **First run:** the model reads `SensorKnob` / `ThresholdKnob` from the base workspace. If the build fails with an *"undefined variable"* error, run `run('data/TunableParameter.m')` first (Step 0), then click **Monitor &amp; Tune** again.</w:t>
+        <w:t>⚠️ **First run:** the model reads `SensorKnob` / `ThresholdKnob` from the base workspace. If the build fails with an *"undefined variable"* error, run `run('data/TunableParameter.m')` first (Step 1), then click **Monitor &amp; Tune** again.</w:t>
       </w:r>
     </w:p>
     <w:p>
@@ -3006,7 +3006,7 @@
         <w:pStyle w:val="Heading1"/>
       </w:pPr>
       <w:r>
-        <w:t>8. Step 9 — Validate the Field Mapping</w:t>
+        <w:t>9. Step 10 — Validate the Field Mapping</w:t>
       </w:r>
     </w:p>
     <w:tbl>
@@ -3341,7 +3341,7 @@
         <w:pStyle w:val="Heading1"/>
       </w:pPr>
       <w:r>
-        <w:t>9. Challenge (~10 min)</w:t>
+        <w:t>10. Challenge (~10 min)</w:t>
       </w:r>
     </w:p>
     <w:p>
@@ -3354,7 +3354,7 @@
         <w:pStyle w:val="Heading1"/>
       </w:pPr>
       <w:r>
-        <w:t>10. Summary</w:t>
+        <w:t>11. Summary</w:t>
       </w:r>
     </w:p>
     <w:tbl>
@@ -3826,7 +3826,7 @@
         <w:pStyle w:val="Heading1"/>
       </w:pPr>
       <w:r>
-        <w:t>11. Troubleshooting</w:t>
+        <w:t>12. Troubleshooting</w:t>
       </w:r>
     </w:p>
     <w:tbl>
@@ -4333,7 +4333,7 @@
         <w:pStyle w:val="Heading1"/>
       </w:pPr>
       <w:r>
-        <w:t>12. MathWorks References</w:t>
+        <w:t>13. MathWorks References</w:t>
       </w:r>
     </w:p>
     <w:p>

</xml_diff>

<commit_message>
Correct prerequisite hardware to match the model and BOM
The Prerequisites section described potentiometers, a breadboard and an
external LED/buzzer on D2 - hardware left over from a different workshop.
The model itself loops the ESP32's own DAC output back into its ADC
(Analog Input -> Gain 1/16 -> DataTypeConversion -> Analog Output), and
ComponentList_V1.0.xlsx lists only the board plus two F-F Dupont jumpers.

Hardware now states:
- ESP32-WROOM DevKit V1 (30-pin) + micro-USB cable
- 2 F-F Dupont jumpers: DAC1 (GPIO25) -> A4 (GPIO32), DAC2 (GPIO26) -> A5 (GPIO33)
- no sensors/pots/breadboard/external LED; FanControl drives the onboard LED on GPIO2

Pin numbers verified against ESP32WROOMTemplateBoard.m (AnalogPins paired
with AnalogPinRef), not assumed. Also corrected the Figure 6 caption,
which wrongly referred to wiring "the sensor".

Docs: README.md, README_id.md and both WS1 guides updated; DOCX and MLX
regenerated from the Markdown sources.
</commit_message>
<xml_diff>
--- a/workshop instruction/WS1 - Simulink IoT with ThingSpeak and ESP32_en.docx
+++ b/workshop instruction/WS1 - Simulink IoT with ThingSpeak and ESP32_en.docx
@@ -1277,7 +1277,7 @@
         <w:rPr>
           <w:sz w:val="20"/>
         </w:rPr>
-        <w:t xml:space="preserve"> Keep this chart next to the board while you wire the sensor, the DAC loop-back, and the fan output:</w:t>
+        <w:t xml:space="preserve"> Keep this chart next to the board while you jumper the DAC loop-back and locate the FanControl LED:</w:t>
       </w:r>
     </w:p>
     <w:p>
@@ -1360,7 +1360,7 @@
           <w:i/>
           <w:sz w:val="18"/>
         </w:rPr>
-        <w:t xml:space="preserve"> GPIO numbers — read the GPIO and ADC labels instead. This workshop uses the analogue inputs on </w:t>
+        <w:t xml:space="preserve"> GPIO numbers — read the GPIO and ADC labels instead. This workshop uses the analogue inputs </w:t>
       </w:r>
       <w:r>
         <w:rPr>
@@ -1368,14 +1368,14 @@
           <w:i/>
           <w:sz w:val="18"/>
         </w:rPr>
-        <w:t>pins 4 and 5</w:t>
+        <w:t>A4/A5</w:t>
       </w:r>
       <w:r>
         <w:rPr>
           <w:i/>
           <w:sz w:val="18"/>
         </w:rPr>
-        <w:t xml:space="preserve">, the DAC loop-back on </w:t>
+        <w:t xml:space="preserve"> (</w:t>
       </w:r>
       <w:r>
         <w:rPr>
@@ -1383,14 +1383,14 @@
           <w:i/>
           <w:sz w:val="18"/>
         </w:rPr>
-        <w:t>DAC1/DAC2</w:t>
+        <w:t>GPIO32/GPIO33</w:t>
       </w:r>
       <w:r>
         <w:rPr>
           <w:i/>
           <w:sz w:val="18"/>
         </w:rPr>
-        <w:t xml:space="preserve">, and the digital output on </w:t>
+        <w:t xml:space="preserve">), the DAC loop-back </w:t>
       </w:r>
       <w:r>
         <w:rPr>
@@ -1398,7 +1398,7 @@
           <w:i/>
           <w:sz w:val="18"/>
         </w:rPr>
-        <w:t>pin 2</w:t>
+        <w:t>DAC1/DAC2</w:t>
       </w:r>
       <w:r>
         <w:rPr>
@@ -1409,18 +1409,48 @@
       </w:r>
       <w:r>
         <w:rPr>
-          <w:rFonts w:ascii="Consolas" w:hAnsi="Consolas"/>
-          <w:i/>
-          <w:sz w:val="16"/>
-        </w:rPr>
-        <w:t>D2</w:t>
-      </w:r>
-      <w:r>
-        <w:rPr>
+          <w:b/>
           <w:i/>
           <w:sz w:val="18"/>
         </w:rPr>
-        <w:t>).</w:t>
+        <w:t>GPIO25/GPIO26</w:t>
+      </w:r>
+      <w:r>
+        <w:rPr>
+          <w:i/>
+          <w:sz w:val="18"/>
+        </w:rPr>
+        <w:t xml:space="preserve">), and the digital output </w:t>
+      </w:r>
+      <w:r>
+        <w:rPr>
+          <w:b/>
+          <w:i/>
+          <w:sz w:val="18"/>
+        </w:rPr>
+        <w:t>D2</w:t>
+      </w:r>
+      <w:r>
+        <w:rPr>
+          <w:i/>
+          <w:sz w:val="18"/>
+        </w:rPr>
+        <w:t xml:space="preserve"> (</w:t>
+      </w:r>
+      <w:r>
+        <w:rPr>
+          <w:b/>
+          <w:i/>
+          <w:sz w:val="18"/>
+        </w:rPr>
+        <w:t>GPIO2</w:t>
+      </w:r>
+      <w:r>
+        <w:rPr>
+          <w:i/>
+          <w:sz w:val="18"/>
+        </w:rPr>
+        <w:t>, the board's onboard LED).</w:t>
       </w:r>
     </w:p>
     <w:p>

</xml_diff>

<commit_message>
Remove challenge section and presenter narration from WS1 guides
Drops the "## 10. Challenge" exercise and the four presenter narration
callouts from both language guides, then fixes everything that pointed at
them:
- duration 120 -> 100 minutes (both guides and both READMEs)
- "six phases" -> "five phases"; agenda item 6 removed
- "2-hour workshop" -> "100-minute workshop"
- sections renumbered: Summary 11 -> 10, Troubleshooting 12 -> 11,
  References 13 -> 12 (EN and ID)

DOCX and MLX regenerated from the Markdown sources.
</commit_message>
<xml_diff>
--- a/workshop instruction/WS1 - Simulink IoT with ThingSpeak and ESP32_en.docx
+++ b/workshop instruction/WS1 - Simulink IoT with ThingSpeak and ESP32_en.docx
@@ -90,7 +90,7 @@
                 <w:rFonts w:ascii="Calibri" w:hAnsi="Calibri"/>
                 <w:sz w:val="20"/>
               </w:rPr>
-              <w:t>120 minutes (30 min IoT setup + 40 min model build + 30 min deploy &amp; live data + 20 min challenge)</w:t>
+              <w:t>100 minutes (30 min IoT setup + 40 min model build + 30 min deploy &amp; live data)</w:t>
             </w:r>
           </w:p>
         </w:tc>
@@ -295,7 +295,7 @@
         <w:rPr>
           <w:sz w:val="20"/>
         </w:rPr>
-        <w:t xml:space="preserve">In this 2-hour hands-on workshop you build a </w:t>
+        <w:t xml:space="preserve">In this 100-minute hands-on workshop you build a </w:t>
       </w:r>
       <w:r>
         <w:rPr>
@@ -564,7 +564,7 @@
         <w:rPr>
           <w:sz w:val="20"/>
         </w:rPr>
-        <w:t>You work through the workshop in six phases:</w:t>
+        <w:t>You work through the workshop in five phases:</w:t>
       </w:r>
     </w:p>
     <w:p>
@@ -670,27 +670,6 @@
           <w:sz w:val="20"/>
         </w:rPr>
         <w:t xml:space="preserve"> — run in external (Monitor &amp; Tune) mode, watch the ThingSpeak charts update.</w:t>
-      </w:r>
-    </w:p>
-    <w:p>
-      <w:r>
-        <w:rPr>
-          <w:sz w:val="20"/>
-        </w:rPr>
-        <w:t xml:space="preserve">6. ✅ </w:t>
-      </w:r>
-      <w:r>
-        <w:rPr>
-          <w:b/>
-          <w:sz w:val="20"/>
-        </w:rPr>
-        <w:t>Challenge</w:t>
-      </w:r>
-      <w:r>
-        <w:rPr>
-          <w:sz w:val="20"/>
-        </w:rPr>
-        <w:t xml:space="preserve"> — change the update rate, add a field, and watch the physical output react.</w:t>
       </w:r>
     </w:p>
     <w:p>
@@ -1451,40 +1430,6 @@
           <w:sz w:val="18"/>
         </w:rPr>
         <w:t>, the board's onboard LED).</w:t>
-      </w:r>
-    </w:p>
-    <w:p>
-      <w:r>
-        <w:rPr>
-          <w:sz w:val="20"/>
-        </w:rPr>
-        <w:t xml:space="preserve">🎤 </w:t>
-      </w:r>
-      <w:r>
-        <w:rPr>
-          <w:b/>
-          <w:sz w:val="20"/>
-        </w:rPr>
-        <w:t>Narration (presenter):</w:t>
-      </w:r>
-      <w:r>
-        <w:rPr>
-          <w:sz w:val="20"/>
-        </w:rPr>
-        <w:t xml:space="preserve"> "Everything in IoT comes back to three questions: </w:t>
-      </w:r>
-      <w:r>
-        <w:rPr>
-          <w:i/>
-          <w:sz w:val="20"/>
-        </w:rPr>
-        <w:t>how do I get data in, where does it go, and how do I get it back?</w:t>
-      </w:r>
-      <w:r>
-        <w:rPr>
-          <w:sz w:val="20"/>
-        </w:rPr>
-        <w:t xml:space="preserve"> Today the ESP32 is our gateway — it reads the sensor, publishes over MQTT to ThingSpeak, and reads its own channel back. That is a complete IoT loop."</w:t>
       </w:r>
     </w:p>
     <w:p>
@@ -2394,79 +2339,6 @@
       </w:r>
     </w:p>
     <w:p>
-      <w:r>
-        <w:rPr>
-          <w:sz w:val="20"/>
-        </w:rPr>
-        <w:t xml:space="preserve">🎤 </w:t>
-      </w:r>
-      <w:r>
-        <w:rPr>
-          <w:b/>
-          <w:sz w:val="20"/>
-        </w:rPr>
-        <w:t>Narration (presenter):</w:t>
-      </w:r>
-      <w:r>
-        <w:rPr>
-          <w:sz w:val="20"/>
-        </w:rPr>
-        <w:t xml:space="preserve"> "Notice the field names — </w:t>
-      </w:r>
-      <w:r>
-        <w:rPr>
-          <w:rFonts w:ascii="Consolas" w:hAnsi="Consolas"/>
-          <w:sz w:val="18"/>
-        </w:rPr>
-        <w:t>TemperatureData</w:t>
-      </w:r>
-      <w:r>
-        <w:rPr>
-          <w:sz w:val="20"/>
-        </w:rPr>
-        <w:t xml:space="preserve">, </w:t>
-      </w:r>
-      <w:r>
-        <w:rPr>
-          <w:rFonts w:ascii="Consolas" w:hAnsi="Consolas"/>
-          <w:sz w:val="18"/>
-        </w:rPr>
-        <w:t>ThresholdData</w:t>
-      </w:r>
-      <w:r>
-        <w:rPr>
-          <w:sz w:val="20"/>
-        </w:rPr>
-        <w:t xml:space="preserve">, </w:t>
-      </w:r>
-      <w:r>
-        <w:rPr>
-          <w:rFonts w:ascii="Consolas" w:hAnsi="Consolas"/>
-          <w:sz w:val="18"/>
-        </w:rPr>
-        <w:t>FanControl</w:t>
-      </w:r>
-      <w:r>
-        <w:rPr>
-          <w:sz w:val="20"/>
-        </w:rPr>
-        <w:t xml:space="preserve">. Those are not just labels. ThingSpeak stores every value in a numbered field, and the model builds the message </w:t>
-      </w:r>
-      <w:r>
-        <w:rPr>
-          <w:rFonts w:ascii="Consolas" w:hAnsi="Consolas"/>
-          <w:sz w:val="18"/>
-        </w:rPr>
-        <w:t>field1=…&amp;field2=…&amp;field3=…</w:t>
-      </w:r>
-      <w:r>
-        <w:rPr>
-          <w:sz w:val="20"/>
-        </w:rPr>
-        <w:t xml:space="preserve"> that exactly matches this channel. Get the names wrong and the data lands in the wrong field."</w:t>
-      </w:r>
-    </w:p>
-    <w:p>
       <w:pPr>
         <w:pStyle w:val="Heading1"/>
       </w:pPr>
@@ -2930,79 +2802,6 @@
           <w:sz w:val="20"/>
         </w:rPr>
         <w:t xml:space="preserve"> — visualize scaled values and on/off states.</w:t>
-      </w:r>
-    </w:p>
-    <w:p>
-      <w:r>
-        <w:rPr>
-          <w:sz w:val="20"/>
-        </w:rPr>
-        <w:t xml:space="preserve">🎤 </w:t>
-      </w:r>
-      <w:r>
-        <w:rPr>
-          <w:b/>
-          <w:sz w:val="20"/>
-        </w:rPr>
-        <w:t>Narration (presenter):</w:t>
-      </w:r>
-      <w:r>
-        <w:rPr>
-          <w:sz w:val="20"/>
-        </w:rPr>
-        <w:t xml:space="preserve"> "The starter model is the wiring harness — all the </w:t>
-      </w:r>
-      <w:r>
-        <w:rPr>
-          <w:i/>
-          <w:sz w:val="20"/>
-        </w:rPr>
-        <w:t>plumbing</w:t>
-      </w:r>
-      <w:r>
-        <w:rPr>
-          <w:sz w:val="20"/>
-        </w:rPr>
-        <w:t xml:space="preserve"> is already there. Notice the </w:t>
-      </w:r>
-      <w:r>
-        <w:rPr>
-          <w:rFonts w:ascii="Consolas" w:hAnsi="Consolas"/>
-          <w:sz w:val="18"/>
-        </w:rPr>
-        <w:t>GoTo</w:t>
-      </w:r>
-      <w:r>
-        <w:rPr>
-          <w:sz w:val="20"/>
-        </w:rPr>
-        <w:t>/</w:t>
-      </w:r>
-      <w:r>
-        <w:rPr>
-          <w:rFonts w:ascii="Consolas" w:hAnsi="Consolas"/>
-          <w:sz w:val="18"/>
-        </w:rPr>
-        <w:t>From</w:t>
-      </w:r>
-      <w:r>
-        <w:rPr>
-          <w:sz w:val="20"/>
-        </w:rPr>
-        <w:t xml:space="preserve"> tags: they work like named buses so we can route a signal across the canvas without drawing every wire. Your job now is to add the </w:t>
-      </w:r>
-      <w:r>
-        <w:rPr>
-          <w:i/>
-          <w:sz w:val="20"/>
-        </w:rPr>
-        <w:t>engine</w:t>
-      </w:r>
-      <w:r>
-        <w:rPr>
-          <w:sz w:val="20"/>
-        </w:rPr>
-        <w:t>: the real ADC inputs, the threshold logic, and the IoT blocks that talk to ThingSpeak."</w:t>
       </w:r>
     </w:p>
     <w:p>
@@ -6883,27 +6682,6 @@
       </w:r>
     </w:p>
     <w:p>
-      <w:r>
-        <w:rPr>
-          <w:sz w:val="20"/>
-        </w:rPr>
-        <w:t xml:space="preserve">🎤 </w:t>
-      </w:r>
-      <w:r>
-        <w:rPr>
-          <w:b/>
-          <w:sz w:val="20"/>
-        </w:rPr>
-        <w:t>Narration (presenter):</w:t>
-      </w:r>
-      <w:r>
-        <w:rPr>
-          <w:sz w:val="20"/>
-        </w:rPr>
-        <w:t xml:space="preserve"> "This is the IoT loop made visible: the ESP32 reads → publishes over MQTT → ThingSpeak stores it → the model reads its own channel back. If you can see Field 3 flipping in the cloud while you drag the knob, every link in the chain works."</w:t>
-      </w:r>
-    </w:p>
-    <w:p>
       <w:pPr>
         <w:pStyle w:val="Heading1"/>
       </w:pPr>
@@ -7372,88 +7150,7 @@
         <w:pStyle w:val="Heading1"/>
       </w:pPr>
       <w:r>
-        <w:t>10. Challenge (~10 min)</w:t>
-      </w:r>
-    </w:p>
-    <w:p>
-      <w:r>
-        <w:rPr>
-          <w:sz w:val="20"/>
-        </w:rPr>
-        <w:t xml:space="preserve">1. </w:t>
-      </w:r>
-      <w:r>
-        <w:rPr>
-          <w:b/>
-          <w:sz w:val="20"/>
-        </w:rPr>
-        <w:t>Speed it up:</w:t>
-      </w:r>
-      <w:r>
-        <w:rPr>
-          <w:sz w:val="20"/>
-        </w:rPr>
-        <w:t xml:space="preserve"> change the </w:t>
-      </w:r>
-      <w:r>
-        <w:rPr>
-          <w:b/>
-          <w:sz w:val="20"/>
-        </w:rPr>
-        <w:t>Update interval</w:t>
-      </w:r>
-      <w:r>
-        <w:rPr>
-          <w:sz w:val="20"/>
-        </w:rPr>
-        <w:t xml:space="preserve"> of </w:t>
-      </w:r>
-      <w:r>
-        <w:rPr>
-          <w:i/>
-          <w:sz w:val="20"/>
-        </w:rPr>
-        <w:t>WiFi MQTT Publish</w:t>
-      </w:r>
-      <w:r>
-        <w:rPr>
-          <w:sz w:val="20"/>
-        </w:rPr>
-        <w:t xml:space="preserve"> from </w:t>
-      </w:r>
-      <w:r>
-        <w:rPr>
-          <w:rFonts w:ascii="Consolas" w:hAnsi="Consolas"/>
-          <w:sz w:val="18"/>
-        </w:rPr>
-        <w:t>60</w:t>
-      </w:r>
-      <w:r>
-        <w:rPr>
-          <w:sz w:val="20"/>
-        </w:rPr>
-        <w:t xml:space="preserve"> to </w:t>
-      </w:r>
-      <w:r>
-        <w:rPr>
-          <w:rFonts w:ascii="Consolas" w:hAnsi="Consolas"/>
-          <w:sz w:val="18"/>
-        </w:rPr>
-        <w:t>30</w:t>
-      </w:r>
-      <w:r>
-        <w:rPr>
-          <w:sz w:val="20"/>
-        </w:rPr>
-        <w:t xml:space="preserve"> seconds. Re-run and watch the Field 1 chart update twice as fast. Keep in mind ThingSpeak's free-tier write limits.</w:t>
-      </w:r>
-    </w:p>
-    <w:p>
-      <w:pPr>
-        <w:pStyle w:val="Heading1"/>
-      </w:pPr>
-      <w:r>
-        <w:t>11. Summary</w:t>
+        <w:t>10. Summary</w:t>
       </w:r>
     </w:p>
     <w:tbl>
@@ -7925,7 +7622,7 @@
         <w:pStyle w:val="Heading1"/>
       </w:pPr>
       <w:r>
-        <w:t>12. Troubleshooting</w:t>
+        <w:t>11. Troubleshooting</w:t>
       </w:r>
     </w:p>
     <w:tbl>
@@ -8432,7 +8129,7 @@
         <w:pStyle w:val="Heading1"/>
       </w:pPr>
       <w:r>
-        <w:t>13. MathWorks References</w:t>
+        <w:t>12. MathWorks References</w:t>
       </w:r>
     </w:p>
     <w:p>

</xml_diff>